<commit_message>
Verify live checkpoint inference and finish evidence-backed demo documents
</commit_message>
<xml_diff>
--- a/reports/anchored_improvement/Bao_cao_cai_tien_TPOUR_retention.docx
+++ b/reports/anchored_improvement/Bao_cao_cai_tien_TPOUR_retention.docx
@@ -1214,6 +1214,47 @@
       </w:r>
     </w:p>
     <w:p>
+      <w:r>
+        <w:t>Demo inference riêng đã hoàn tất trên Kaggle: 4 nhánh đều khớp top-3 truy vấn cố định với rankings đã lưu; sai số score lớn nhất 4.77e-07. Hash checkpoint thật khớp bản đánh giá. Một query mới cũng chạy bằng encoder và index thực; query mới chưa có qrels nên không báo accuracy. Notebook và log nằm trong results/anchored_kaggle/live_demo.</w:t>
+      </w:r>
+    </w:p>
+    <w:p>
+      <w:r>
+        <w:drawing>
+          <wp:inline xmlns:a="http://schemas.openxmlformats.org/drawingml/2006/main" xmlns:pic="http://schemas.openxmlformats.org/drawingml/2006/picture">
+            <wp:extent cx="5577840" cy="3042458"/>
+            <wp:docPr id="6" name="Picture 6"/>
+            <wp:cNvGraphicFramePr>
+              <a:graphicFrameLocks noChangeAspect="1"/>
+            </wp:cNvGraphicFramePr>
+            <a:graphic>
+              <a:graphicData uri="http://schemas.openxmlformats.org/drawingml/2006/picture">
+                <pic:pic>
+                  <pic:nvPicPr>
+                    <pic:cNvPr id="0" name="06_live_inference.png"/>
+                    <pic:cNvPicPr/>
+                  </pic:nvPicPr>
+                  <pic:blipFill>
+                    <a:blip r:embed="rId14"/>
+                    <a:stretch>
+                      <a:fillRect/>
+                    </a:stretch>
+                  </pic:blipFill>
+                  <pic:spPr>
+                    <a:xfrm>
+                      <a:off x="0" y="0"/>
+                      <a:ext cx="5577840" cy="3042458"/>
+                    </a:xfrm>
+                    <a:prstGeom prst="rect"/>
+                  </pic:spPr>
+                </pic:pic>
+              </a:graphicData>
+            </a:graphic>
+          </wp:inline>
+        </w:drawing>
+      </w:r>
+    </w:p>
+    <w:p>
       <w:pPr>
         <w:pStyle w:val="Heading1"/>
       </w:pPr>

</xml_diff>